<commit_message>
test(delivery): verificar cierre Auth aprobado y renovar informe UML APK y evidencias
Consolidación de trabajo local de Codex bajo DEC-AI-AUTH-001.
No representa implementación manual, sprint o revisión del equipo.
Fuentes originales/baseline/evidencia preservados; sin deploy ni datos reales.
</commit_message>
<xml_diff>
--- a/delivery/Informe-Inkr8-P4.docx
+++ b/delivery/Informe-Inkr8-P4.docx
@@ -51,7 +51,7 @@
     </w:p>
     <w:p>
       <w:r>
-        <w:t>El núcleo, las retiradas aprobadas y las temporadas cuentan con comprobaciones locales. Los siete métodos Android con reglas estrictas pasan. La validación externa de R8, la política cloud auténtica y las obligaciones individuales del curso siguen pendientes; este informe permite revisar la entrega sin presentar esos límites como resueltos.</w:t>
+        <w:t>El núcleo, las retiradas aprobadas y las temporadas cuentan con comprobaciones locales. Los ocho métodos Android con reglas estrictas pasan. La validación externa de R8, la política cloud auténtica y las obligaciones individuales del curso siguen pendientes; este informe permite revisar la entrega sin presentar esos límites como resueltos.</w:t>
       </w:r>
     </w:p>
     <w:tbl>
@@ -1166,7 +1166,7 @@
                 <w:b w:val="0"/>
                 <w:sz w:val="20"/>
               </w:rPr>
-              <w:t>FIN-002: 7 métodos Android PASS</w:t>
+              <w:t>FIN-002: 8 métodos Android PASS</w:t>
             </w:r>
           </w:p>
         </w:tc>
@@ -1183,7 +1183,7 @@
                 <w:b w:val="0"/>
                 <w:sz w:val="20"/>
               </w:rPr>
-              <w:t>Seis flujos y callback de borrado bajo reglas nuevas propuestas; repeticiones anteriores no se suman.</w:t>
+              <w:t>Seis flujos, borrado y cierre Auth bajo reglas nuevas propuestas; repeticiones anteriores no se suman.</w:t>
             </w:r>
           </w:p>
         </w:tc>
@@ -1283,7 +1283,7 @@
                 <w:b w:val="0"/>
                 <w:sz w:val="20"/>
               </w:rPr>
-              <w:t>FIN-002: 287 contrastes estáticos PASS</w:t>
+              <w:t>FIN-002: 289 contrastes estáticos PASS</w:t>
             </w:r>
           </w:p>
         </w:tc>
@@ -1300,7 +1300,7 @@
                 <w:b w:val="0"/>
                 <w:sz w:val="20"/>
               </w:rPr>
-              <w:t>Oráculos de conservación/trazabilidad; no 287 pruebas funcionales.</w:t>
+              <w:t>Oráculos de conservación/trazabilidad; no 289 pruebas funcionales.</w:t>
             </w:r>
           </w:p>
         </w:tc>
@@ -2031,7 +2031,7 @@
       <w:r>
         <w:drawing>
           <wp:inline xmlns:a="http://schemas.openxmlformats.org/drawingml/2006/main" xmlns:pic="http://schemas.openxmlformats.org/drawingml/2006/picture">
-            <wp:extent cx="5943600" cy="3653165"/>
+            <wp:extent cx="5943600" cy="3105464"/>
             <wp:docPr id="1" name="Picture 1"/>
             <wp:cNvGraphicFramePr>
               <a:graphicFrameLocks noChangeAspect="1"/>
@@ -2052,7 +2052,7 @@
                   <pic:spPr>
                     <a:xfrm>
                       <a:off x="0" y="0"/>
-                      <a:ext cx="5943600" cy="3653165"/>
+                      <a:ext cx="5943600" cy="3105464"/>
                     </a:xfrm>
                     <a:prstGeom prst="rect"/>
                   </pic:spPr>
@@ -2088,7 +2088,7 @@
       <w:r>
         <w:drawing>
           <wp:inline xmlns:a="http://schemas.openxmlformats.org/drawingml/2006/main" xmlns:pic="http://schemas.openxmlformats.org/drawingml/2006/picture">
-            <wp:extent cx="5943600" cy="2413917"/>
+            <wp:extent cx="5943600" cy="2203147"/>
             <wp:docPr id="2" name="Picture 2"/>
             <wp:cNvGraphicFramePr>
               <a:graphicFrameLocks noChangeAspect="1"/>
@@ -2109,7 +2109,7 @@
                   <pic:spPr>
                     <a:xfrm>
                       <a:off x="0" y="0"/>
-                      <a:ext cx="5943600" cy="2413917"/>
+                      <a:ext cx="5943600" cy="2203147"/>
                     </a:xfrm>
                     <a:prstGeom prst="rect"/>
                   </pic:spPr>
@@ -3193,7 +3193,7 @@
       <w:r>
         <w:drawing>
           <wp:inline xmlns:a="http://schemas.openxmlformats.org/drawingml/2006/main" xmlns:pic="http://schemas.openxmlformats.org/drawingml/2006/picture">
-            <wp:extent cx="5943600" cy="5242311"/>
+            <wp:extent cx="5943600" cy="5450614"/>
             <wp:docPr id="6" name="Picture 6"/>
             <wp:cNvGraphicFramePr>
               <a:graphicFrameLocks noChangeAspect="1"/>
@@ -3214,7 +3214,7 @@
                   <pic:spPr>
                     <a:xfrm>
                       <a:off x="0" y="0"/>
-                      <a:ext cx="5943600" cy="5242311"/>
+                      <a:ext cx="5943600" cy="5450614"/>
                     </a:xfrm>
                     <a:prstGeom prst="rect"/>
                   </pic:spPr>
@@ -3253,7 +3253,7 @@
     </w:p>
     <w:p>
       <w:r>
-        <w:t>La propuesta deniega el cierre de cuenta cliente: el ciclo anterior permitía recrear saldo sin cierre Auth confiable. Settings informa error. Restituirlo requiere ciclo Auth confiable y política; no consta una retirada aprobada de esa función. Las reglas no prueban antiabuso de metadata ni reserva única en servidor. Philosopher conserva un placeholder que acepta cualquier token no vacío; no valida compras y bloquea cloud. Se retiró el token del log con prueba roja/verde y economía intacta. No se borraron datos reales ni se acredita seguridad cloud completa.</w:t>
+        <w:t>Marco aceptó posteriormente cerrar acceso Auth conservando datos. UserRepository mantiene callbacks y usa closeAccount: marcador Functions-only accountClosed/accountClosedAt, disable y revoke Auth. Tokens anteriores quedan denegados en reglas/callables; fallo parcial permite reintento sin reset. Perfil, username, historial, saldos, rating y reservas permanecen. Settings informa retención y termina sesión tras confirmación. Diecinueve casos REST/SDK/HTTP y el flujo Android pasan. No se valida IAM/Auth cloud. Philosopher conserva su placeholder previo de compras; sólo se retiró token del log. Reglas nuevas no acreditan antiabuso de metadata o reserva única servidor.</w:t>
       </w:r>
     </w:p>
     <w:p>
@@ -3367,7 +3367,7 @@
                 <w:b w:val="0"/>
                 <w:sz w:val="20"/>
               </w:rPr>
-              <w:t>FIN-002 ANDROID_ACCEPTANCE_FINAL.json</w:t>
+              <w:t>FIN-002 ANDROID_ACCEPTANCE_ACCOUNT_FINAL.json</w:t>
             </w:r>
           </w:p>
         </w:tc>
@@ -3384,7 +3384,7 @@
                 <w:b w:val="0"/>
                 <w:sz w:val="20"/>
               </w:rPr>
-              <w:t>7 PASS</w:t>
+              <w:t>8 PASS</w:t>
             </w:r>
           </w:p>
         </w:tc>
@@ -3591,7 +3591,7 @@
                 <w:b w:val="0"/>
                 <w:sz w:val="20"/>
               </w:rPr>
-              <w:t>FIN-002 audit-final-deletion/audit.json</w:t>
+              <w:t>FIN-002 audit-final-account/audit.json</w:t>
             </w:r>
           </w:p>
         </w:tc>
@@ -3608,7 +3608,7 @@
                 <w:b w:val="0"/>
                 <w:sz w:val="20"/>
               </w:rPr>
-              <w:t>287 PASS estáticos</w:t>
+              <w:t>289 PASS estáticos</w:t>
             </w:r>
           </w:p>
         </w:tc>
@@ -3641,7 +3641,7 @@
     </w:p>
     <w:p>
       <w:r>
-        <w:t>Historial fallaba por esperar el encabezado con puntos suspensivos antes de concluir el callable; ahora espera la fila de historia. El rechazo fallaba durante carga y luego por fixture inferior al mínimo de 50 palabras de Standard; se espera editor y se prepara texto válido. No se cambiaron límites productivos ni aserciones de rating, rechazo, contenido o borrador. La suite final de siete métodos pasa; los logs rojos y el error de compilación del soporte inicial se conservan.</w:t>
+        <w:t>Historial fallaba por esperar el encabezado con puntos suspensivos antes de concluir el callable; ahora espera la fila de historia. El rechazo fallaba durante carga y luego por fixture inferior al mínimo de 50 palabras de Standard; se espera editor y se prepara texto válido. No se cambiaron límites productivos ni aserciones de rating, rechazo, contenido o borrador. La suite final de ocho métodos incluye el cierre Auth aprobado posteriormente y pasa; los logs rojos y el error de compilación del soporte inicial se conservan.</w:t>
       </w:r>
     </w:p>
     <w:p>

</xml_diff>